<commit_message>
Feat: Ejercicio de la app Woof con tema claro y oscuro completado
</commit_message>
<xml_diff>
--- a/262DSMG123200127T3/Cuestionarios/Cuestionarios Unidad 3.docx
+++ b/262DSMG123200127T3/Cuestionarios/Cuestionarios Unidad 3.docx
@@ -68,6 +68,9 @@
         <w:jc w:val="center"/>
       </w:pPr>
       <w:r>
+        <w:rPr>
+          <w:noProof/>
+        </w:rPr>
         <w:drawing>
           <wp:inline distT="0" distB="0" distL="0" distR="0" wp14:anchorId="784CF8F9" wp14:editId="3F5635E2">
             <wp:extent cx="1714500" cy="1990725"/>
@@ -237,26 +240,15 @@
     <w:p>
       <w:pPr>
         <w:jc w:val="center"/>
-      </w:pPr>
-      <w:r>
-        <w:t xml:space="preserve">Desarrollo de </w:t>
-      </w:r>
-      <w:proofErr w:type="spellStart"/>
-      <w:r>
-        <w:t>A</w:t>
-      </w:r>
-      <w:r>
-        <w:t>plicaciones</w:t>
-      </w:r>
-      <w:proofErr w:type="spellEnd"/>
-      <w:r>
-        <w:t xml:space="preserve"> </w:t>
-      </w:r>
-      <w:r>
-        <w:t>M</w:t>
-      </w:r>
-      <w:r>
-        <w:t>óviles</w:t>
+        <w:rPr>
+          <w:lang w:val="es-ES"/>
+        </w:rPr>
+      </w:pPr>
+      <w:r>
+        <w:rPr>
+          <w:lang w:val="es-ES"/>
+        </w:rPr>
+        <w:t>Desarrollo de Aplicaciones Móviles</w:t>
       </w:r>
     </w:p>
     <w:p>
@@ -331,28 +323,32 @@
         <w:rPr>
           <w:b/>
           <w:bCs/>
-        </w:rPr>
-      </w:pPr>
-      <w:r>
-        <w:rPr>
-          <w:b/>
-          <w:bCs/>
+          <w:lang w:val="es-ES"/>
+        </w:rPr>
+      </w:pPr>
+      <w:r>
+        <w:rPr>
+          <w:b/>
+          <w:bCs/>
+          <w:lang w:val="es-ES"/>
         </w:rPr>
         <w:t xml:space="preserve">Lima, </w:t>
       </w:r>
-      <w:proofErr w:type="spellStart"/>
-      <w:r>
-        <w:rPr>
-          <w:b/>
-          <w:bCs/>
+      <w:proofErr w:type="gramStart"/>
+      <w:r>
+        <w:rPr>
+          <w:b/>
+          <w:bCs/>
+          <w:lang w:val="es-ES"/>
         </w:rPr>
         <w:t>Enero</w:t>
       </w:r>
-      <w:proofErr w:type="spellEnd"/>
-      <w:r>
-        <w:rPr>
-          <w:b/>
-          <w:bCs/>
+      <w:proofErr w:type="gramEnd"/>
+      <w:r>
+        <w:rPr>
+          <w:b/>
+          <w:bCs/>
+          <w:lang w:val="es-ES"/>
         </w:rPr>
         <w:t xml:space="preserve"> de 2026</w:t>
       </w:r>
@@ -369,6 +365,9 @@
     </w:p>
     <w:p>
       <w:r>
+        <w:rPr>
+          <w:noProof/>
+        </w:rPr>
         <w:drawing>
           <wp:inline distT="0" distB="0" distL="0" distR="0" wp14:anchorId="4C7A6A3E" wp14:editId="0E92EEF8">
             <wp:extent cx="5943600" cy="3317240"/>
@@ -408,6 +407,9 @@
     </w:p>
     <w:p>
       <w:r>
+        <w:rPr>
+          <w:noProof/>
+        </w:rPr>
         <w:drawing>
           <wp:inline distT="0" distB="0" distL="0" distR="0" wp14:anchorId="756EF111" wp14:editId="73C36253">
             <wp:extent cx="5943600" cy="3427095"/>
@@ -448,6 +450,9 @@
     <w:p/>
     <w:p>
       <w:r>
+        <w:rPr>
+          <w:noProof/>
+        </w:rPr>
         <w:lastRenderedPageBreak/>
         <w:drawing>
           <wp:inline distT="0" distB="0" distL="0" distR="0" wp14:anchorId="094BC54A" wp14:editId="02EE63C4">
@@ -489,6 +494,9 @@
     <w:p/>
     <w:p>
       <w:r>
+        <w:rPr>
+          <w:noProof/>
+        </w:rPr>
         <w:drawing>
           <wp:inline distT="0" distB="0" distL="0" distR="0" wp14:anchorId="449350C7" wp14:editId="5D5278E9">
             <wp:extent cx="5943600" cy="2413635"/>
@@ -528,6 +536,9 @@
     </w:p>
     <w:p>
       <w:r>
+        <w:rPr>
+          <w:noProof/>
+        </w:rPr>
         <w:lastRenderedPageBreak/>
         <w:drawing>
           <wp:inline distT="0" distB="0" distL="0" distR="0" wp14:anchorId="03E88CB4" wp14:editId="4D5396C6">
@@ -568,6 +579,9 @@
     </w:p>
     <w:p>
       <w:r>
+        <w:rPr>
+          <w:noProof/>
+        </w:rPr>
         <w:drawing>
           <wp:inline distT="0" distB="0" distL="0" distR="0" wp14:anchorId="3EE71660" wp14:editId="6AED659A">
             <wp:extent cx="5943600" cy="3691255"/>
@@ -624,6 +638,234 @@
         </w:rPr>
         <w:lastRenderedPageBreak/>
         <w:t>RUTA 2: CUESTIONARIO</w:t>
+      </w:r>
+    </w:p>
+    <w:p>
+      <w:pPr>
+        <w:rPr>
+          <w:b/>
+          <w:bCs/>
+        </w:rPr>
+      </w:pPr>
+      <w:r>
+        <w:rPr>
+          <w:b/>
+          <w:bCs/>
+        </w:rPr>
+        <w:drawing>
+          <wp:inline distT="0" distB="0" distL="0" distR="0" wp14:anchorId="45CCDEB0" wp14:editId="4B98554B">
+            <wp:extent cx="5943600" cy="3364230"/>
+            <wp:effectExtent l="0" t="0" r="0" b="7620"/>
+            <wp:docPr id="1667749241" name="Imagen 1"/>
+            <wp:cNvGraphicFramePr>
+              <a:graphicFrameLocks xmlns:a="http://schemas.openxmlformats.org/drawingml/2006/main" noChangeAspect="1"/>
+            </wp:cNvGraphicFramePr>
+            <a:graphic xmlns:a="http://schemas.openxmlformats.org/drawingml/2006/main">
+              <a:graphicData uri="http://schemas.openxmlformats.org/drawingml/2006/picture">
+                <pic:pic xmlns:pic="http://schemas.openxmlformats.org/drawingml/2006/picture">
+                  <pic:nvPicPr>
+                    <pic:cNvPr id="1667749241" name=""/>
+                    <pic:cNvPicPr/>
+                  </pic:nvPicPr>
+                  <pic:blipFill>
+                    <a:blip r:embed="rId11"/>
+                    <a:stretch>
+                      <a:fillRect/>
+                    </a:stretch>
+                  </pic:blipFill>
+                  <pic:spPr>
+                    <a:xfrm>
+                      <a:off x="0" y="0"/>
+                      <a:ext cx="5943600" cy="3364230"/>
+                    </a:xfrm>
+                    <a:prstGeom prst="rect">
+                      <a:avLst/>
+                    </a:prstGeom>
+                  </pic:spPr>
+                </pic:pic>
+              </a:graphicData>
+            </a:graphic>
+          </wp:inline>
+        </w:drawing>
+      </w:r>
+    </w:p>
+    <w:p>
+      <w:pPr>
+        <w:rPr>
+          <w:b/>
+          <w:bCs/>
+        </w:rPr>
+      </w:pPr>
+      <w:r>
+        <w:rPr>
+          <w:b/>
+          <w:bCs/>
+        </w:rPr>
+        <w:drawing>
+          <wp:inline distT="0" distB="0" distL="0" distR="0" wp14:anchorId="2DE194B6" wp14:editId="30568DCE">
+            <wp:extent cx="5943600" cy="3627755"/>
+            <wp:effectExtent l="0" t="0" r="0" b="0"/>
+            <wp:docPr id="1590150973" name="Imagen 1"/>
+            <wp:cNvGraphicFramePr>
+              <a:graphicFrameLocks xmlns:a="http://schemas.openxmlformats.org/drawingml/2006/main" noChangeAspect="1"/>
+            </wp:cNvGraphicFramePr>
+            <a:graphic xmlns:a="http://schemas.openxmlformats.org/drawingml/2006/main">
+              <a:graphicData uri="http://schemas.openxmlformats.org/drawingml/2006/picture">
+                <pic:pic xmlns:pic="http://schemas.openxmlformats.org/drawingml/2006/picture">
+                  <pic:nvPicPr>
+                    <pic:cNvPr id="1590150973" name=""/>
+                    <pic:cNvPicPr/>
+                  </pic:nvPicPr>
+                  <pic:blipFill>
+                    <a:blip r:embed="rId12"/>
+                    <a:stretch>
+                      <a:fillRect/>
+                    </a:stretch>
+                  </pic:blipFill>
+                  <pic:spPr>
+                    <a:xfrm>
+                      <a:off x="0" y="0"/>
+                      <a:ext cx="5943600" cy="3627755"/>
+                    </a:xfrm>
+                    <a:prstGeom prst="rect">
+                      <a:avLst/>
+                    </a:prstGeom>
+                  </pic:spPr>
+                </pic:pic>
+              </a:graphicData>
+            </a:graphic>
+          </wp:inline>
+        </w:drawing>
+      </w:r>
+    </w:p>
+    <w:p>
+      <w:pPr>
+        <w:rPr>
+          <w:b/>
+          <w:bCs/>
+        </w:rPr>
+      </w:pPr>
+      <w:r>
+        <w:rPr>
+          <w:b/>
+          <w:bCs/>
+        </w:rPr>
+        <w:lastRenderedPageBreak/>
+        <w:drawing>
+          <wp:inline distT="0" distB="0" distL="0" distR="0" wp14:anchorId="7C7A8C87" wp14:editId="46C46BFB">
+            <wp:extent cx="5943600" cy="3457575"/>
+            <wp:effectExtent l="0" t="0" r="0" b="9525"/>
+            <wp:docPr id="1102677825" name="Imagen 1"/>
+            <wp:cNvGraphicFramePr>
+              <a:graphicFrameLocks xmlns:a="http://schemas.openxmlformats.org/drawingml/2006/main" noChangeAspect="1"/>
+            </wp:cNvGraphicFramePr>
+            <a:graphic xmlns:a="http://schemas.openxmlformats.org/drawingml/2006/main">
+              <a:graphicData uri="http://schemas.openxmlformats.org/drawingml/2006/picture">
+                <pic:pic xmlns:pic="http://schemas.openxmlformats.org/drawingml/2006/picture">
+                  <pic:nvPicPr>
+                    <pic:cNvPr id="1102677825" name=""/>
+                    <pic:cNvPicPr/>
+                  </pic:nvPicPr>
+                  <pic:blipFill>
+                    <a:blip r:embed="rId13"/>
+                    <a:stretch>
+                      <a:fillRect/>
+                    </a:stretch>
+                  </pic:blipFill>
+                  <pic:spPr>
+                    <a:xfrm>
+                      <a:off x="0" y="0"/>
+                      <a:ext cx="5943600" cy="3457575"/>
+                    </a:xfrm>
+                    <a:prstGeom prst="rect">
+                      <a:avLst/>
+                    </a:prstGeom>
+                  </pic:spPr>
+                </pic:pic>
+              </a:graphicData>
+            </a:graphic>
+          </wp:inline>
+        </w:drawing>
+      </w:r>
+    </w:p>
+    <w:p>
+      <w:pPr>
+        <w:rPr>
+          <w:b/>
+          <w:bCs/>
+        </w:rPr>
+      </w:pPr>
+      <w:r>
+        <w:rPr>
+          <w:b/>
+          <w:bCs/>
+        </w:rPr>
+        <w:drawing>
+          <wp:inline distT="0" distB="0" distL="0" distR="0" wp14:anchorId="00217329" wp14:editId="28B45014">
+            <wp:extent cx="5943600" cy="3409950"/>
+            <wp:effectExtent l="0" t="0" r="0" b="0"/>
+            <wp:docPr id="509118884" name="Imagen 1"/>
+            <wp:cNvGraphicFramePr>
+              <a:graphicFrameLocks xmlns:a="http://schemas.openxmlformats.org/drawingml/2006/main" noChangeAspect="1"/>
+            </wp:cNvGraphicFramePr>
+            <a:graphic xmlns:a="http://schemas.openxmlformats.org/drawingml/2006/main">
+              <a:graphicData uri="http://schemas.openxmlformats.org/drawingml/2006/picture">
+                <pic:pic xmlns:pic="http://schemas.openxmlformats.org/drawingml/2006/picture">
+                  <pic:nvPicPr>
+                    <pic:cNvPr id="509118884" name=""/>
+                    <pic:cNvPicPr/>
+                  </pic:nvPicPr>
+                  <pic:blipFill>
+                    <a:blip r:embed="rId14"/>
+                    <a:stretch>
+                      <a:fillRect/>
+                    </a:stretch>
+                  </pic:blipFill>
+                  <pic:spPr>
+                    <a:xfrm>
+                      <a:off x="0" y="0"/>
+                      <a:ext cx="5943600" cy="3409950"/>
+                    </a:xfrm>
+                    <a:prstGeom prst="rect">
+                      <a:avLst/>
+                    </a:prstGeom>
+                  </pic:spPr>
+                </pic:pic>
+              </a:graphicData>
+            </a:graphic>
+          </wp:inline>
+        </w:drawing>
+      </w:r>
+    </w:p>
+    <w:p>
+      <w:pPr>
+        <w:rPr>
+          <w:b/>
+          <w:bCs/>
+        </w:rPr>
+      </w:pPr>
+      <w:r>
+        <w:rPr>
+          <w:b/>
+          <w:bCs/>
+        </w:rPr>
+        <w:br w:type="page"/>
+      </w:r>
+    </w:p>
+    <w:p>
+      <w:pPr>
+        <w:rPr>
+          <w:b/>
+          <w:bCs/>
+        </w:rPr>
+      </w:pPr>
+      <w:r>
+        <w:rPr>
+          <w:b/>
+          <w:bCs/>
+        </w:rPr>
+        <w:lastRenderedPageBreak/>
+        <w:t>RUTA 3: CUESTIONARIO</w:t>
       </w:r>
     </w:p>
     <w:sectPr>
@@ -1239,6 +1481,7 @@
   <w:style w:type="character" w:default="1" w:styleId="Fuentedeprrafopredeter">
     <w:name w:val="Default Paragraph Font"/>
     <w:uiPriority w:val="1"/>
+    <w:semiHidden/>
     <w:unhideWhenUsed/>
   </w:style>
   <w:style w:type="table" w:default="1" w:styleId="Tablanormal">

</xml_diff>